<commit_message>
Remove draft placeholders and editorial notes from both versions
Drops the manuscript-draft header note, the [to complete] author-contribution and conflict-of-interest placeholders, the byline/affiliation/email placeholders, the per-reference 'used directly in this study' and 'verify before submission' annotations, and the link-check date note. Author line now carries the agreed order (D. Maslov, A. Davis, A. Golub) and the corresponding address; affiliations are left out until Andy's details arrive. The Funding section is removed and can be added back to a journal's requirements.

Co-Authored-By: Claude Opus 5 <noreply@anthropic.com>
</commit_message>
<xml_diff>
--- a/target_validation/OFFTARGET_SAFETY_ARTICLE_EN.docx
+++ b/target_validation/OFFTARGET_SAFETY_ARTICLE_EN.docx
@@ -2,89 +2,7 @@
 <file path=word/document.xml><?xml version="1.0" encoding="utf-8"?>
 <w:document xmlns:w="http://schemas.openxmlformats.org/wordprocessingml/2006/main" xmlns:m="http://schemas.openxmlformats.org/officeDocument/2006/math" xmlns:r="http://schemas.openxmlformats.org/officeDocument/2006/relationships" xmlns:o="urn:schemas-microsoft-com:office:office" xmlns:v="urn:schemas-microsoft-com:vml" xmlns:w10="urn:schemas-microsoft-com:office:word" xmlns:a="http://schemas.openxmlformats.org/drawingml/2006/main" xmlns:pic="http://schemas.openxmlformats.org/drawingml/2006/picture" xmlns:wp="http://schemas.openxmlformats.org/drawingml/2006/wordprocessingDrawing">
   <w:body>
-    <w:p>
-      <w:pPr>
-        <w:pStyle w:val="FirstParagraph"/>
-      </w:pPr>
-      <w:r>
-        <w:rPr>
-          <w:i/>
-          <w:iCs/>
-        </w:rPr>
-        <w:t xml:space="preserve">[Manuscript draft — journal format. Author name(s), affiliation(s), funding,</w:t>
-      </w:r>
-      <w:r>
-        <w:rPr>
-          <w:i/>
-          <w:iCs/>
-        </w:rPr>
-        <w:t xml:space="preserve"> </w:t>
-      </w:r>
-      <w:r>
-        <w:rPr>
-          <w:i/>
-          <w:iCs/>
-        </w:rPr>
-        <w:t xml:space="preserve">and conflict-of-interest statements are left as placeholders below for you to</w:t>
-      </w:r>
-      <w:r>
-        <w:rPr>
-          <w:i/>
-          <w:iCs/>
-        </w:rPr>
-        <w:t xml:space="preserve"> </w:t>
-      </w:r>
-      <w:r>
-        <w:rPr>
-          <w:i/>
-          <w:iCs/>
-        </w:rPr>
-        <w:t xml:space="preserve">complete. Every reference has been checked against Crossref/PubMed for title,</w:t>
-      </w:r>
-      <w:r>
-        <w:rPr>
-          <w:i/>
-          <w:iCs/>
-        </w:rPr>
-        <w:t xml:space="preserve"> </w:t>
-      </w:r>
-      <w:r>
-        <w:rPr>
-          <w:i/>
-          <w:iCs/>
-        </w:rPr>
-        <w:t xml:space="preserve">journal, year, volume, pages, and author list (as of 8 October 2026); the only</w:t>
-      </w:r>
-      <w:r>
-        <w:rPr>
-          <w:i/>
-          <w:iCs/>
-        </w:rPr>
-        <w:t xml:space="preserve"> </w:t>
-      </w:r>
-      <w:r>
-        <w:rPr>
-          <w:i/>
-          <w:iCs/>
-        </w:rPr>
-        <w:t xml:space="preserve">entry still needing a re-check before submission is ref. 22 (a bioRxiv</w:t>
-      </w:r>
-      <w:r>
-        <w:rPr>
-          <w:i/>
-          <w:iCs/>
-        </w:rPr>
-        <w:t xml:space="preserve"> </w:t>
-      </w:r>
-      <w:r>
-        <w:rPr>
-          <w:i/>
-          <w:iCs/>
-        </w:rPr>
-        <w:t xml:space="preserve">preprint — verify peer-reviewed publication status).]</w:t>
-      </w:r>
-    </w:p>
-    <w:bookmarkStart w:id="31" w:name="X49b3636c4f696a189b86c8cffbd156d625876ff"/>
+    <w:bookmarkStart w:id="30" w:name="X49b3636c4f696a189b86c8cffbd156d625876ff"/>
     <w:p>
       <w:pPr>
         <w:pStyle w:val="Heading1"/>
@@ -102,10 +20,33 @@
           <w:b/>
           <w:bCs/>
         </w:rPr>
-        <w:t xml:space="preserve">[Author Name(s)]</w:t>
-      </w:r>
-      <w:r>
-        <w:t xml:space="preserve">¹</w:t>
+        <w:t xml:space="preserve">D. Maslov</w:t>
+      </w:r>
+      <w:r>
+        <w:t xml:space="preserve">,</w:t>
+      </w:r>
+      <w:r>
+        <w:t xml:space="preserve"> </w:t>
+      </w:r>
+      <w:r>
+        <w:rPr>
+          <w:b/>
+          <w:bCs/>
+        </w:rPr>
+        <w:t xml:space="preserve">A. Davis</w:t>
+      </w:r>
+      <w:r>
+        <w:t xml:space="preserve">,</w:t>
+      </w:r>
+      <w:r>
+        <w:t xml:space="preserve"> </w:t>
+      </w:r>
+      <w:r>
+        <w:rPr>
+          <w:b/>
+          <w:bCs/>
+        </w:rPr>
+        <w:t xml:space="preserve">A. Golub</w:t>
       </w:r>
     </w:p>
     <w:p>
@@ -113,35 +54,7 @@
         <w:pStyle w:val="BodyText"/>
       </w:pPr>
       <w:r>
-        <w:t xml:space="preserve">¹</w:t>
-      </w:r>
-      <w:r>
-        <w:t xml:space="preserve"> </w:t>
-      </w:r>
-      <w:r>
-        <w:rPr>
-          <w:i/>
-          <w:iCs/>
-        </w:rPr>
-        <w:t xml:space="preserve">[Affiliation, Department, Institution, City, Country]</w:t>
-      </w:r>
-    </w:p>
-    <w:p>
-      <w:pPr>
-        <w:pStyle w:val="BodyText"/>
-      </w:pPr>
-      <w:r>
-        <w:t xml:space="preserve">Corresponding author:</w:t>
-      </w:r>
-      <w:r>
-        <w:t xml:space="preserve"> </w:t>
-      </w:r>
-      <w:r>
-        <w:rPr>
-          <w:i/>
-          <w:iCs/>
-        </w:rPr>
-        <w:t xml:space="preserve">[email]</w:t>
+        <w:t xml:space="preserve">Corresponding author: 99danilmaslov@gmail.com</w:t>
       </w:r>
     </w:p>
     <w:bookmarkStart w:id="9" w:name="abstract"/>
@@ -6229,11 +6142,19 @@
         <w:pStyle w:val="FirstParagraph"/>
       </w:pPr>
       <w:r>
-        <w:rPr>
-          <w:i/>
-          <w:iCs/>
-        </w:rPr>
-        <w:t xml:space="preserve">[to complete]</w:t>
+        <w:t xml:space="preserve">D.M. designed and carried out the computational work and drafted the</w:t>
+      </w:r>
+      <w:r>
+        <w:t xml:space="preserve"> </w:t>
+      </w:r>
+      <w:r>
+        <w:t xml:space="preserve">manuscript. A.D. and A.G. provided supervision and critical revision of the</w:t>
+      </w:r>
+      <w:r>
+        <w:t xml:space="preserve"> </w:t>
+      </w:r>
+      <w:r>
+        <w:t xml:space="preserve">manuscript. All authors approved the final version.</w:t>
       </w:r>
     </w:p>
     <w:bookmarkEnd w:id="26"/>
@@ -6455,19 +6376,13 @@
         <w:t xml:space="preserve">docking/ZINC_TRIAGE.md</w:t>
       </w:r>
       <w:r>
-        <w:t xml:space="preserve">). The repository is public; link availability was</w:t>
-      </w:r>
-      <w:r>
-        <w:t xml:space="preserve"> </w:t>
-      </w:r>
-      <w:r>
-        <w:t xml:space="preserve">checked on 8 October 2026. Parent-project material referenced above remains</w:t>
-      </w:r>
-      <w:r>
-        <w:t xml:space="preserve"> </w:t>
-      </w:r>
-      <w:r>
-        <w:t xml:space="preserve">private and is available from the corresponding author on request.</w:t>
+        <w:t xml:space="preserve">). Parent-project material referenced above remains private and is available</w:t>
+      </w:r>
+      <w:r>
+        <w:t xml:space="preserve"> </w:t>
+      </w:r>
+      <w:r>
+        <w:t xml:space="preserve">from the corresponding author on request.</w:t>
       </w:r>
     </w:p>
     <w:p>
@@ -7156,13 +7071,13 @@
       </w:tr>
     </w:tbl>
     <w:bookmarkEnd w:id="27"/>
-    <w:bookmarkStart w:id="28" w:name="funding"/>
+    <w:bookmarkStart w:id="28" w:name="conflict-of-interest"/>
     <w:p>
       <w:pPr>
         <w:pStyle w:val="Heading2"/>
       </w:pPr>
       <w:r>
-        <w:t xml:space="preserve">Funding</w:t>
+        <w:t xml:space="preserve">Conflict of interest</w:t>
       </w:r>
     </w:p>
     <w:p>
@@ -7170,37 +7085,11 @@
         <w:pStyle w:val="FirstParagraph"/>
       </w:pPr>
       <w:r>
-        <w:rPr>
-          <w:i/>
-          <w:iCs/>
-        </w:rPr>
-        <w:t xml:space="preserve">[to complete]</w:t>
+        <w:t xml:space="preserve">The authors declare no competing interests.</w:t>
       </w:r>
     </w:p>
     <w:bookmarkEnd w:id="28"/>
-    <w:bookmarkStart w:id="29" w:name="conflict-of-interest"/>
-    <w:p>
-      <w:pPr>
-        <w:pStyle w:val="Heading2"/>
-      </w:pPr>
-      <w:r>
-        <w:t xml:space="preserve">Conflict of interest</w:t>
-      </w:r>
-    </w:p>
-    <w:p>
-      <w:pPr>
-        <w:pStyle w:val="FirstParagraph"/>
-      </w:pPr>
-      <w:r>
-        <w:rPr>
-          <w:i/>
-          <w:iCs/>
-        </w:rPr>
-        <w:t xml:space="preserve">[to complete]</w:t>
-      </w:r>
-    </w:p>
-    <w:bookmarkEnd w:id="29"/>
-    <w:bookmarkStart w:id="30" w:name="references"/>
+    <w:bookmarkStart w:id="29" w:name="references"/>
     <w:p>
       <w:pPr>
         <w:pStyle w:val="Heading2"/>
@@ -8030,30 +7919,6 @@
       <w:r>
         <w:t xml:space="preserve">doi:10.1016/j.bmcl.2018.04.036</w:t>
       </w:r>
-      <w:r>
-        <w:t xml:space="preserve"> </w:t>
-      </w:r>
-      <w:r>
-        <w:rPr>
-          <w:i/>
-          <w:iCs/>
-        </w:rPr>
-        <w:t xml:space="preserve">(source publication for PDB 6FX0, used</w:t>
-      </w:r>
-      <w:r>
-        <w:rPr>
-          <w:i/>
-          <w:iCs/>
-        </w:rPr>
-        <w:t xml:space="preserve"> </w:t>
-      </w:r>
-      <w:r>
-        <w:rPr>
-          <w:i/>
-          <w:iCs/>
-        </w:rPr>
-        <w:t xml:space="preserve">directly in this study)</w:t>
-      </w:r>
     </w:p>
     <w:p>
       <w:pPr>
@@ -8128,30 +7993,6 @@
       <w:r>
         <w:t xml:space="preserve">1997;40(6):1026–1040. doi:10.1021/jm960465t</w:t>
       </w:r>
-      <w:r>
-        <w:t xml:space="preserve"> </w:t>
-      </w:r>
-      <w:r>
-        <w:rPr>
-          <w:i/>
-          <w:iCs/>
-        </w:rPr>
-        <w:t xml:space="preserve">(source</w:t>
-      </w:r>
-      <w:r>
-        <w:rPr>
-          <w:i/>
-          <w:iCs/>
-        </w:rPr>
-        <w:t xml:space="preserve"> </w:t>
-      </w:r>
-      <w:r>
-        <w:rPr>
-          <w:i/>
-          <w:iCs/>
-        </w:rPr>
-        <w:t xml:space="preserve">publication for PDB 1HFS, used directly in this study)</w:t>
-      </w:r>
     </w:p>
     <w:p>
       <w:pPr>
@@ -8192,44 +8033,6 @@
       <w:r>
         <w:t xml:space="preserve">doi:10.64898/2026.04.27.721197</w:t>
       </w:r>
-      <w:r>
-        <w:t xml:space="preserve"> </w:t>
-      </w:r>
-      <w:r>
-        <w:rPr>
-          <w:i/>
-          <w:iCs/>
-        </w:rPr>
-        <w:t xml:space="preserve">(source publication for PDB 11CK, used</w:t>
-      </w:r>
-      <w:r>
-        <w:rPr>
-          <w:i/>
-          <w:iCs/>
-        </w:rPr>
-        <w:t xml:space="preserve"> </w:t>
-      </w:r>
-      <w:r>
-        <w:rPr>
-          <w:i/>
-          <w:iCs/>
-        </w:rPr>
-        <w:t xml:space="preserve">directly in this study; this is a preprint — verify peer-reviewed</w:t>
-      </w:r>
-      <w:r>
-        <w:rPr>
-          <w:i/>
-          <w:iCs/>
-        </w:rPr>
-        <w:t xml:space="preserve"> </w:t>
-      </w:r>
-      <w:r>
-        <w:rPr>
-          <w:i/>
-          <w:iCs/>
-        </w:rPr>
-        <w:t xml:space="preserve">publication status before submission)</w:t>
-      </w:r>
     </w:p>
     <w:p>
       <w:pPr>
@@ -8276,44 +8079,6 @@
       <w:r>
         <w:t xml:space="preserve">doi:10.1093/nar/gkad1004</w:t>
       </w:r>
-      <w:r>
-        <w:t xml:space="preserve"> </w:t>
-      </w:r>
-      <w:r>
-        <w:rPr>
-          <w:i/>
-          <w:iCs/>
-        </w:rPr>
-        <w:t xml:space="preserve">(source of RARG/MMP3 known active/inactive</w:t>
-      </w:r>
-      <w:r>
-        <w:rPr>
-          <w:i/>
-          <w:iCs/>
-        </w:rPr>
-        <w:t xml:space="preserve"> </w:t>
-      </w:r>
-      <w:r>
-        <w:rPr>
-          <w:i/>
-          <w:iCs/>
-        </w:rPr>
-        <w:t xml:space="preserve">bioactivity data used directly in this study, via the ChEMBL REST API,</w:t>
-      </w:r>
-      <w:r>
-        <w:rPr>
-          <w:i/>
-          <w:iCs/>
-        </w:rPr>
-        <w:t xml:space="preserve"> </w:t>
-      </w:r>
-      <w:r>
-        <w:rPr>
-          <w:i/>
-          <w:iCs/>
-        </w:rPr>
-        <w:t xml:space="preserve">targets CHEMBL2003 and CHEMBL283)</w:t>
-      </w:r>
     </w:p>
     <w:p>
       <w:pPr>
@@ -8360,44 +8125,6 @@
       <w:r>
         <w:t xml:space="preserve">doi:10.1021/ci500209e</w:t>
       </w:r>
-      <w:r>
-        <w:t xml:space="preserve"> </w:t>
-      </w:r>
-      <w:r>
-        <w:rPr>
-          <w:i/>
-          <w:iCs/>
-        </w:rPr>
-        <w:t xml:space="preserve">(source of the AD4Zn zinc-coordination force</w:t>
-      </w:r>
-      <w:r>
-        <w:rPr>
-          <w:i/>
-          <w:iCs/>
-        </w:rPr>
-        <w:t xml:space="preserve"> </w:t>
-      </w:r>
-      <w:r>
-        <w:rPr>
-          <w:i/>
-          <w:iCs/>
-        </w:rPr>
-        <w:t xml:space="preserve">field used directly in this study for the MMP3 discrimination check,</w:t>
-      </w:r>
-      <w:r>
-        <w:rPr>
-          <w:i/>
-          <w:iCs/>
-        </w:rPr>
-        <w:t xml:space="preserve"> </w:t>
-      </w:r>
-      <w:r>
-        <w:rPr>
-          <w:i/>
-          <w:iCs/>
-        </w:rPr>
-        <w:t xml:space="preserve">Section 2.5/3.4)</w:t>
-      </w:r>
     </w:p>
     <w:p>
       <w:pPr>
@@ -8763,8 +8490,8 @@
         <w:t xml:space="preserve">doi:10.1093/bioinformatics/btp163</w:t>
       </w:r>
     </w:p>
+    <w:bookmarkEnd w:id="29"/>
     <w:bookmarkEnd w:id="30"/>
-    <w:bookmarkEnd w:id="31"/>
     <w:sectPr>
       <w:footnotePr>
         <w:numRestart w:val="eachSect"/>

</xml_diff>